<commit_message>
added sequence diagram to pdf
</commit_message>
<xml_diff>
--- a/PRAC4PDF.docx
+++ b/PRAC4PDF.docx
@@ -978,6 +978,57 @@
         <w:t>The six patterns therefore form one integrated CampusGuard design rather than six unrelated pattern demonstrations.</w:t>
       </w:r>
     </w:p>
+    <w:p/>
+    <w:p/>
+    <w:p>
+      <w:r>
+        <w:rPr>
+          <w:noProof/>
+          <w:lang w:val="en-ZA"/>
+        </w:rPr>
+        <w:drawing>
+          <wp:inline distT="0" distB="0" distL="0" distR="0" wp14:anchorId="0C1936C2" wp14:editId="3E566839">
+            <wp:extent cx="5799455" cy="3192780"/>
+            <wp:effectExtent l="0" t="0" r="0" b="7620"/>
+            <wp:docPr id="2107473365" name="Picture 1"/>
+            <wp:cNvGraphicFramePr>
+              <a:graphicFrameLocks xmlns:a="http://schemas.openxmlformats.org/drawingml/2006/main" noChangeAspect="1"/>
+            </wp:cNvGraphicFramePr>
+            <a:graphic xmlns:a="http://schemas.openxmlformats.org/drawingml/2006/main">
+              <a:graphicData uri="http://schemas.openxmlformats.org/drawingml/2006/picture">
+                <pic:pic xmlns:pic="http://schemas.openxmlformats.org/drawingml/2006/picture">
+                  <pic:nvPicPr>
+                    <pic:cNvPr id="2107473365" name="Picture 2107473365"/>
+                    <pic:cNvPicPr/>
+                  </pic:nvPicPr>
+                  <pic:blipFill>
+                    <a:blip r:embed="rId6">
+                      <a:extLst>
+                        <a:ext uri="{28A0092B-C50C-407E-A947-70E740481C1C}">
+                          <a14:useLocalDpi xmlns:a14="http://schemas.microsoft.com/office/drawing/2010/main" val="0"/>
+                        </a:ext>
+                      </a:extLst>
+                    </a:blip>
+                    <a:stretch>
+                      <a:fillRect/>
+                    </a:stretch>
+                  </pic:blipFill>
+                  <pic:spPr>
+                    <a:xfrm>
+                      <a:off x="0" y="0"/>
+                      <a:ext cx="5806361" cy="3196582"/>
+                    </a:xfrm>
+                    <a:prstGeom prst="rect">
+                      <a:avLst/>
+                    </a:prstGeom>
+                  </pic:spPr>
+                </pic:pic>
+              </a:graphicData>
+            </a:graphic>
+          </wp:inline>
+        </w:drawing>
+      </w:r>
+    </w:p>
     <w:sectPr>
       <w:pgSz w:w="12240" w:h="15840"/>
       <w:pgMar w:top="1008" w:right="1152" w:bottom="1008" w:left="1152" w:header="720" w:footer="720" w:gutter="0"/>

</xml_diff>

<commit_message>
pdf without sequence diagram 2
</commit_message>
<xml_diff>
--- a/PRAC4PDF.docx
+++ b/PRAC4PDF.docx
@@ -167,11 +167,19 @@
             <w:pPr>
               <w:spacing w:after="0"/>
             </w:pPr>
+            <w:proofErr w:type="spellStart"/>
             <w:r>
               <w:rPr>
                 <w:sz w:val="20"/>
               </w:rPr>
-              <w:t>Rochaan Verster</w:t>
+              <w:t>Rochaan</w:t>
+            </w:r>
+            <w:proofErr w:type="spellEnd"/>
+            <w:r>
+              <w:rPr>
+                <w:sz w:val="20"/>
+              </w:rPr>
+              <w:t xml:space="preserve"> Verster</w:t>
             </w:r>
           </w:p>
         </w:tc>
@@ -203,8 +211,13 @@
       </w:r>
     </w:p>
     <w:p>
-      <w:r>
-        <w:t>CampusGuard supports the identification, coordination and management of campus incidents by allowing an operator to dispatch response teams, control affected areas, issue alerts, coordinate evacuations, and cancel or stand down responses.</w:t>
+      <w:proofErr w:type="spellStart"/>
+      <w:r>
+        <w:t>CampusGuard</w:t>
+      </w:r>
+      <w:proofErr w:type="spellEnd"/>
+      <w:r>
+        <w:t xml:space="preserve"> supports the identification, coordination and management of campus incidents by allowing an operator to dispatch response teams, control affected areas, issue alerts, coordinate evacuations, and cancel or stand down responses.</w:t>
       </w:r>
     </w:p>
     <w:p>
@@ -258,12 +271,21 @@
             <w:pPr>
               <w:spacing w:after="0"/>
             </w:pPr>
+            <w:proofErr w:type="spellStart"/>
             <w:r>
               <w:rPr>
                 <w:b/>
                 <w:sz w:val="18"/>
               </w:rPr>
-              <w:t>CampusGuard Implementation</w:t>
+              <w:t>CampusGuard</w:t>
+            </w:r>
+            <w:proofErr w:type="spellEnd"/>
+            <w:r>
+              <w:rPr>
+                <w:b/>
+                <w:sz w:val="18"/>
+              </w:rPr>
+              <w:t xml:space="preserve"> Implementation</w:t>
             </w:r>
           </w:p>
         </w:tc>
@@ -320,8 +342,86 @@
               <w:rPr>
                 <w:sz w:val="18"/>
               </w:rPr>
-              <w:t>Command, DispatchCommand, EvacuateCommand, AlertCommand, CancelCommand, LockdownCommand, CommandInvoker</w:t>
+              <w:t xml:space="preserve">Command, </w:t>
             </w:r>
+            <w:proofErr w:type="spellStart"/>
+            <w:r>
+              <w:rPr>
+                <w:sz w:val="18"/>
+              </w:rPr>
+              <w:t>DispatchCommand</w:t>
+            </w:r>
+            <w:proofErr w:type="spellEnd"/>
+            <w:r>
+              <w:rPr>
+                <w:sz w:val="18"/>
+              </w:rPr>
+              <w:t xml:space="preserve">, </w:t>
+            </w:r>
+            <w:proofErr w:type="spellStart"/>
+            <w:r>
+              <w:rPr>
+                <w:sz w:val="18"/>
+              </w:rPr>
+              <w:t>EvacuateCommand</w:t>
+            </w:r>
+            <w:proofErr w:type="spellEnd"/>
+            <w:r>
+              <w:rPr>
+                <w:sz w:val="18"/>
+              </w:rPr>
+              <w:t xml:space="preserve">, </w:t>
+            </w:r>
+            <w:proofErr w:type="spellStart"/>
+            <w:r>
+              <w:rPr>
+                <w:sz w:val="18"/>
+              </w:rPr>
+              <w:t>AlertCommand</w:t>
+            </w:r>
+            <w:proofErr w:type="spellEnd"/>
+            <w:r>
+              <w:rPr>
+                <w:sz w:val="18"/>
+              </w:rPr>
+              <w:t xml:space="preserve">, </w:t>
+            </w:r>
+            <w:proofErr w:type="spellStart"/>
+            <w:r>
+              <w:rPr>
+                <w:sz w:val="18"/>
+              </w:rPr>
+              <w:t>CancelCommand</w:t>
+            </w:r>
+            <w:proofErr w:type="spellEnd"/>
+            <w:r>
+              <w:rPr>
+                <w:sz w:val="18"/>
+              </w:rPr>
+              <w:t xml:space="preserve">, </w:t>
+            </w:r>
+            <w:proofErr w:type="spellStart"/>
+            <w:r>
+              <w:rPr>
+                <w:sz w:val="18"/>
+              </w:rPr>
+              <w:t>LockdownCommand</w:t>
+            </w:r>
+            <w:proofErr w:type="spellEnd"/>
+            <w:r>
+              <w:rPr>
+                <w:sz w:val="18"/>
+              </w:rPr>
+              <w:t xml:space="preserve">, </w:t>
+            </w:r>
+            <w:proofErr w:type="spellStart"/>
+            <w:r>
+              <w:rPr>
+                <w:sz w:val="18"/>
+              </w:rPr>
+              <w:t>CommandInvoker</w:t>
+            </w:r>
+            <w:proofErr w:type="spellEnd"/>
           </w:p>
         </w:tc>
         <w:tc>
@@ -372,12 +472,14 @@
             <w:pPr>
               <w:spacing w:after="0"/>
             </w:pPr>
+            <w:proofErr w:type="spellStart"/>
             <w:r>
               <w:rPr>
                 <w:sz w:val="18"/>
               </w:rPr>
               <w:t>ResponseMediator</w:t>
             </w:r>
+            <w:proofErr w:type="spellEnd"/>
           </w:p>
         </w:tc>
         <w:tc>
@@ -428,12 +530,14 @@
             <w:pPr>
               <w:spacing w:after="0"/>
             </w:pPr>
+            <w:proofErr w:type="spellStart"/>
             <w:r>
               <w:rPr>
                 <w:sz w:val="18"/>
               </w:rPr>
               <w:t>LegacyAccessAdapter</w:t>
             </w:r>
+            <w:proofErr w:type="spellEnd"/>
           </w:p>
         </w:tc>
         <w:tc>
@@ -449,7 +553,21 @@
               <w:rPr>
                 <w:sz w:val="18"/>
               </w:rPr>
-              <w:t>Converts CampusGuard access requests into the legacy interface.</w:t>
+              <w:t xml:space="preserve">Converts </w:t>
+            </w:r>
+            <w:proofErr w:type="spellStart"/>
+            <w:r>
+              <w:rPr>
+                <w:sz w:val="18"/>
+              </w:rPr>
+              <w:t>CampusGuard</w:t>
+            </w:r>
+            <w:proofErr w:type="spellEnd"/>
+            <w:r>
+              <w:rPr>
+                <w:sz w:val="18"/>
+              </w:rPr>
+              <w:t xml:space="preserve"> access requests into the legacy interface.</w:t>
             </w:r>
           </w:p>
         </w:tc>
@@ -484,12 +602,14 @@
             <w:pPr>
               <w:spacing w:after="0"/>
             </w:pPr>
+            <w:proofErr w:type="spellStart"/>
             <w:r>
               <w:rPr>
                 <w:sz w:val="18"/>
               </w:rPr>
               <w:t>EmergencyOperationsFacade</w:t>
             </w:r>
+            <w:proofErr w:type="spellEnd"/>
           </w:p>
         </w:tc>
         <w:tc>
@@ -540,12 +660,84 @@
             <w:pPr>
               <w:spacing w:after="0"/>
             </w:pPr>
+            <w:proofErr w:type="spellStart"/>
             <w:r>
               <w:rPr>
                 <w:sz w:val="18"/>
               </w:rPr>
-              <w:t>IncidentState, ReportedState, ActiveState, EvacuationState, CancelledState, ResolvedState</w:t>
+              <w:t>IncidentState</w:t>
             </w:r>
+            <w:proofErr w:type="spellEnd"/>
+            <w:r>
+              <w:rPr>
+                <w:sz w:val="18"/>
+              </w:rPr>
+              <w:t xml:space="preserve">, </w:t>
+            </w:r>
+            <w:proofErr w:type="spellStart"/>
+            <w:r>
+              <w:rPr>
+                <w:sz w:val="18"/>
+              </w:rPr>
+              <w:t>ReportedState</w:t>
+            </w:r>
+            <w:proofErr w:type="spellEnd"/>
+            <w:r>
+              <w:rPr>
+                <w:sz w:val="18"/>
+              </w:rPr>
+              <w:t xml:space="preserve">, </w:t>
+            </w:r>
+            <w:proofErr w:type="spellStart"/>
+            <w:r>
+              <w:rPr>
+                <w:sz w:val="18"/>
+              </w:rPr>
+              <w:t>ActiveState</w:t>
+            </w:r>
+            <w:proofErr w:type="spellEnd"/>
+            <w:r>
+              <w:rPr>
+                <w:sz w:val="18"/>
+              </w:rPr>
+              <w:t xml:space="preserve">, </w:t>
+            </w:r>
+            <w:proofErr w:type="spellStart"/>
+            <w:r>
+              <w:rPr>
+                <w:sz w:val="18"/>
+              </w:rPr>
+              <w:t>EvacuationState</w:t>
+            </w:r>
+            <w:proofErr w:type="spellEnd"/>
+            <w:r>
+              <w:rPr>
+                <w:sz w:val="18"/>
+              </w:rPr>
+              <w:t xml:space="preserve">, </w:t>
+            </w:r>
+            <w:proofErr w:type="spellStart"/>
+            <w:r>
+              <w:rPr>
+                <w:sz w:val="18"/>
+              </w:rPr>
+              <w:t>CancelledState</w:t>
+            </w:r>
+            <w:proofErr w:type="spellEnd"/>
+            <w:r>
+              <w:rPr>
+                <w:sz w:val="18"/>
+              </w:rPr>
+              <w:t xml:space="preserve">, </w:t>
+            </w:r>
+            <w:proofErr w:type="spellStart"/>
+            <w:r>
+              <w:rPr>
+                <w:sz w:val="18"/>
+              </w:rPr>
+              <w:t>ResolvedState</w:t>
+            </w:r>
+            <w:proofErr w:type="spellEnd"/>
           </w:p>
         </w:tc>
         <w:tc>
@@ -596,12 +788,70 @@
             <w:pPr>
               <w:spacing w:after="0"/>
             </w:pPr>
+            <w:proofErr w:type="spellStart"/>
             <w:r>
               <w:rPr>
                 <w:sz w:val="18"/>
               </w:rPr>
-              <w:t>IncidentObserver, SecurityTeam, MedicalTeam, FacilitiesStaff, AccessControlUnit</w:t>
+              <w:t>IncidentObserver</w:t>
             </w:r>
+            <w:proofErr w:type="spellEnd"/>
+            <w:r>
+              <w:rPr>
+                <w:sz w:val="18"/>
+              </w:rPr>
+              <w:t xml:space="preserve">, </w:t>
+            </w:r>
+            <w:proofErr w:type="spellStart"/>
+            <w:r>
+              <w:rPr>
+                <w:sz w:val="18"/>
+              </w:rPr>
+              <w:t>SecurityTeam</w:t>
+            </w:r>
+            <w:proofErr w:type="spellEnd"/>
+            <w:r>
+              <w:rPr>
+                <w:sz w:val="18"/>
+              </w:rPr>
+              <w:t xml:space="preserve">, </w:t>
+            </w:r>
+            <w:proofErr w:type="spellStart"/>
+            <w:r>
+              <w:rPr>
+                <w:sz w:val="18"/>
+              </w:rPr>
+              <w:t>MedicalTeam</w:t>
+            </w:r>
+            <w:proofErr w:type="spellEnd"/>
+            <w:r>
+              <w:rPr>
+                <w:sz w:val="18"/>
+              </w:rPr>
+              <w:t xml:space="preserve">, </w:t>
+            </w:r>
+            <w:proofErr w:type="spellStart"/>
+            <w:r>
+              <w:rPr>
+                <w:sz w:val="18"/>
+              </w:rPr>
+              <w:t>FacilitiesStaff</w:t>
+            </w:r>
+            <w:proofErr w:type="spellEnd"/>
+            <w:r>
+              <w:rPr>
+                <w:sz w:val="18"/>
+              </w:rPr>
+              <w:t xml:space="preserve">, </w:t>
+            </w:r>
+            <w:proofErr w:type="spellStart"/>
+            <w:r>
+              <w:rPr>
+                <w:sz w:val="18"/>
+              </w:rPr>
+              <w:t>AccessControlUnit</w:t>
+            </w:r>
+            <w:proofErr w:type="spellEnd"/>
           </w:p>
         </w:tc>
         <w:tc>
@@ -655,9 +905,43 @@
         </w:rPr>
         <w:t xml:space="preserve">Concrete Commands: </w:t>
       </w:r>
-      <w:r>
-        <w:t>DispatchCommand, EvacuateCommand, AlertCommand, CancelCommand, LockdownCommand</w:t>
-      </w:r>
+      <w:proofErr w:type="spellStart"/>
+      <w:r>
+        <w:t>DispatchCommand</w:t>
+      </w:r>
+      <w:proofErr w:type="spellEnd"/>
+      <w:r>
+        <w:t xml:space="preserve">, </w:t>
+      </w:r>
+      <w:proofErr w:type="spellStart"/>
+      <w:r>
+        <w:t>EvacuateCommand</w:t>
+      </w:r>
+      <w:proofErr w:type="spellEnd"/>
+      <w:r>
+        <w:t xml:space="preserve">, </w:t>
+      </w:r>
+      <w:proofErr w:type="spellStart"/>
+      <w:r>
+        <w:t>AlertCommand</w:t>
+      </w:r>
+      <w:proofErr w:type="spellEnd"/>
+      <w:r>
+        <w:t xml:space="preserve">, </w:t>
+      </w:r>
+      <w:proofErr w:type="spellStart"/>
+      <w:r>
+        <w:t>CancelCommand</w:t>
+      </w:r>
+      <w:proofErr w:type="spellEnd"/>
+      <w:r>
+        <w:t xml:space="preserve">, </w:t>
+      </w:r>
+      <w:proofErr w:type="spellStart"/>
+      <w:r>
+        <w:t>LockdownCommand</w:t>
+      </w:r>
+      <w:proofErr w:type="spellEnd"/>
     </w:p>
     <w:p>
       <w:pPr>
@@ -669,9 +953,11 @@
         </w:rPr>
         <w:t xml:space="preserve">Invoker: </w:t>
       </w:r>
+      <w:proofErr w:type="spellStart"/>
       <w:r>
         <w:t>CommandInvoker</w:t>
       </w:r>
+      <w:proofErr w:type="spellEnd"/>
     </w:p>
     <w:p>
       <w:pPr>
@@ -683,9 +969,11 @@
         </w:rPr>
         <w:t xml:space="preserve">Receiver: </w:t>
       </w:r>
+      <w:proofErr w:type="spellStart"/>
       <w:r>
         <w:t>IncidentResponseReceiver</w:t>
       </w:r>
+      <w:proofErr w:type="spellEnd"/>
     </w:p>
     <w:p>
       <w:pPr>
@@ -698,8 +986,13 @@
         <w:t xml:space="preserve">Client: </w:t>
       </w:r>
       <w:r>
-        <w:t>main / EmergencyOperationsFacade</w:t>
-      </w:r>
+        <w:t xml:space="preserve">main / </w:t>
+      </w:r>
+      <w:proofErr w:type="spellStart"/>
+      <w:r>
+        <w:t>EmergencyOperationsFacade</w:t>
+      </w:r>
+      <w:proofErr w:type="spellEnd"/>
     </w:p>
     <w:p>
       <w:pPr>
@@ -716,9 +1009,11 @@
         </w:rPr>
         <w:t xml:space="preserve">Mediator: </w:t>
       </w:r>
+      <w:proofErr w:type="spellStart"/>
       <w:r>
         <w:t>ResponseMediator</w:t>
       </w:r>
+      <w:proofErr w:type="spellEnd"/>
     </w:p>
     <w:p>
       <w:r>
@@ -727,9 +1022,35 @@
         </w:rPr>
         <w:t xml:space="preserve">Colleagues: </w:t>
       </w:r>
-      <w:r>
-        <w:t>SecurityTeam, MedicalTeam, FacilitiesStaff, AccessControlUnit</w:t>
-      </w:r>
+      <w:proofErr w:type="spellStart"/>
+      <w:r>
+        <w:t>SecurityTeam</w:t>
+      </w:r>
+      <w:proofErr w:type="spellEnd"/>
+      <w:r>
+        <w:t xml:space="preserve">, </w:t>
+      </w:r>
+      <w:proofErr w:type="spellStart"/>
+      <w:r>
+        <w:t>MedicalTeam</w:t>
+      </w:r>
+      <w:proofErr w:type="spellEnd"/>
+      <w:r>
+        <w:t xml:space="preserve">, </w:t>
+      </w:r>
+      <w:proofErr w:type="spellStart"/>
+      <w:r>
+        <w:t>FacilitiesStaff</w:t>
+      </w:r>
+      <w:proofErr w:type="spellEnd"/>
+      <w:r>
+        <w:t xml:space="preserve">, </w:t>
+      </w:r>
+      <w:proofErr w:type="spellStart"/>
+      <w:r>
+        <w:t>AccessControlUnit</w:t>
+      </w:r>
+      <w:proofErr w:type="spellEnd"/>
     </w:p>
     <w:p>
       <w:r>
@@ -752,9 +1073,11 @@
         </w:rPr>
         <w:t xml:space="preserve">Target: </w:t>
       </w:r>
+      <w:proofErr w:type="spellStart"/>
       <w:r>
         <w:t>AccessControlService</w:t>
       </w:r>
+      <w:proofErr w:type="spellEnd"/>
     </w:p>
     <w:p>
       <w:r>
@@ -763,20 +1086,32 @@
         </w:rPr>
         <w:t xml:space="preserve">Adapter: </w:t>
       </w:r>
+      <w:proofErr w:type="spellStart"/>
       <w:r>
         <w:t>LegacyAccessAdapter</w:t>
       </w:r>
+      <w:proofErr w:type="spellEnd"/>
     </w:p>
     <w:p>
+      <w:proofErr w:type="spellStart"/>
       <w:r>
         <w:rPr>
           <w:b/>
         </w:rPr>
-        <w:t xml:space="preserve">Adaptee: </w:t>
-      </w:r>
+        <w:t>Adaptee</w:t>
+      </w:r>
+      <w:proofErr w:type="spellEnd"/>
+      <w:r>
+        <w:rPr>
+          <w:b/>
+        </w:rPr>
+        <w:t xml:space="preserve">: </w:t>
+      </w:r>
+      <w:proofErr w:type="spellStart"/>
       <w:r>
         <w:t>LegacyAccessControlSystem</w:t>
       </w:r>
+      <w:proofErr w:type="spellEnd"/>
     </w:p>
     <w:p>
       <w:r>
@@ -785,9 +1120,11 @@
         </w:rPr>
         <w:t xml:space="preserve">Client: </w:t>
       </w:r>
+      <w:proofErr w:type="spellStart"/>
       <w:r>
         <w:t>AccessControlUnit</w:t>
       </w:r>
+      <w:proofErr w:type="spellEnd"/>
     </w:p>
     <w:p>
       <w:pPr>
@@ -804,9 +1141,11 @@
         </w:rPr>
         <w:t xml:space="preserve">Facade: </w:t>
       </w:r>
+      <w:proofErr w:type="spellStart"/>
       <w:r>
         <w:t>EmergencyOperationsFacade</w:t>
       </w:r>
+      <w:proofErr w:type="spellEnd"/>
     </w:p>
     <w:p>
       <w:r>
@@ -815,9 +1154,59 @@
         </w:rPr>
         <w:t xml:space="preserve">Subsystems: </w:t>
       </w:r>
-      <w:r>
-        <w:t>CommandInvoker, DispatchCommand, LockdownCommand, AlertCommand, EvacuateCommand, CancelCommand, IncidentResponseReceiver</w:t>
-      </w:r>
+      <w:proofErr w:type="spellStart"/>
+      <w:r>
+        <w:t>CommandInvoker</w:t>
+      </w:r>
+      <w:proofErr w:type="spellEnd"/>
+      <w:r>
+        <w:t xml:space="preserve">, </w:t>
+      </w:r>
+      <w:proofErr w:type="spellStart"/>
+      <w:r>
+        <w:t>DispatchCommand</w:t>
+      </w:r>
+      <w:proofErr w:type="spellEnd"/>
+      <w:r>
+        <w:t xml:space="preserve">, </w:t>
+      </w:r>
+      <w:proofErr w:type="spellStart"/>
+      <w:r>
+        <w:t>LockdownCommand</w:t>
+      </w:r>
+      <w:proofErr w:type="spellEnd"/>
+      <w:r>
+        <w:t xml:space="preserve">, </w:t>
+      </w:r>
+      <w:proofErr w:type="spellStart"/>
+      <w:r>
+        <w:t>AlertCommand</w:t>
+      </w:r>
+      <w:proofErr w:type="spellEnd"/>
+      <w:r>
+        <w:t xml:space="preserve">, </w:t>
+      </w:r>
+      <w:proofErr w:type="spellStart"/>
+      <w:r>
+        <w:t>EvacuateCommand</w:t>
+      </w:r>
+      <w:proofErr w:type="spellEnd"/>
+      <w:r>
+        <w:t xml:space="preserve">, </w:t>
+      </w:r>
+      <w:proofErr w:type="spellStart"/>
+      <w:r>
+        <w:t>CancelCommand</w:t>
+      </w:r>
+      <w:proofErr w:type="spellEnd"/>
+      <w:r>
+        <w:t xml:space="preserve">, </w:t>
+      </w:r>
+      <w:proofErr w:type="spellStart"/>
+      <w:r>
+        <w:t>IncidentResponseReceiver</w:t>
+      </w:r>
+      <w:proofErr w:type="spellEnd"/>
     </w:p>
     <w:p>
       <w:pPr>
@@ -835,7 +1224,23 @@
         <w:t xml:space="preserve">Design problem: </w:t>
       </w:r>
       <w:r>
-        <w:t>An incident's behaviour depends on its current status.</w:t>
+        <w:t xml:space="preserve">An incident's </w:t>
+      </w:r>
+      <w:proofErr w:type="spellStart"/>
+      <w:r>
+        <w:t>behaviour</w:t>
+      </w:r>
+      <w:proofErr w:type="spellEnd"/>
+      <w:r>
+        <w:t xml:space="preserve"> depends on its </w:t>
+      </w:r>
+      <w:proofErr w:type="gramStart"/>
+      <w:r>
+        <w:t>current status</w:t>
+      </w:r>
+      <w:proofErr w:type="gramEnd"/>
+      <w:r>
+        <w:t>.</w:t>
       </w:r>
     </w:p>
     <w:p>
@@ -846,12 +1251,68 @@
         <w:t xml:space="preserve">Participants: </w:t>
       </w:r>
       <w:r>
-        <w:t>Context – Incident; State – IncidentState; Concrete States – ReportedState, ActiveState, EvacuationState, CancelledState, ResolvedState.</w:t>
+        <w:t xml:space="preserve">Context – Incident; State – </w:t>
+      </w:r>
+      <w:proofErr w:type="spellStart"/>
+      <w:r>
+        <w:t>IncidentState</w:t>
+      </w:r>
+      <w:proofErr w:type="spellEnd"/>
+      <w:r>
+        <w:t xml:space="preserve">; Concrete States – </w:t>
+      </w:r>
+      <w:proofErr w:type="spellStart"/>
+      <w:r>
+        <w:t>ReportedState</w:t>
+      </w:r>
+      <w:proofErr w:type="spellEnd"/>
+      <w:r>
+        <w:t xml:space="preserve">, </w:t>
+      </w:r>
+      <w:proofErr w:type="spellStart"/>
+      <w:r>
+        <w:t>ActiveState</w:t>
+      </w:r>
+      <w:proofErr w:type="spellEnd"/>
+      <w:r>
+        <w:t xml:space="preserve">, </w:t>
+      </w:r>
+      <w:proofErr w:type="spellStart"/>
+      <w:r>
+        <w:t>EvacuationState</w:t>
+      </w:r>
+      <w:proofErr w:type="spellEnd"/>
+      <w:r>
+        <w:t xml:space="preserve">, </w:t>
+      </w:r>
+      <w:proofErr w:type="spellStart"/>
+      <w:r>
+        <w:t>CancelledState</w:t>
+      </w:r>
+      <w:proofErr w:type="spellEnd"/>
+      <w:r>
+        <w:t xml:space="preserve">, </w:t>
+      </w:r>
+      <w:proofErr w:type="spellStart"/>
+      <w:r>
+        <w:t>ResolvedState</w:t>
+      </w:r>
+      <w:proofErr w:type="spellEnd"/>
+      <w:r>
+        <w:t>.</w:t>
       </w:r>
     </w:p>
     <w:p>
       <w:r>
-        <w:t>The State pattern is preferable to putting all status-specific behaviour directly into Incident because the status representation can change independently of the incident itself.</w:t>
+        <w:t xml:space="preserve">The State pattern is preferable to putting all status-specific </w:t>
+      </w:r>
+      <w:proofErr w:type="spellStart"/>
+      <w:r>
+        <w:t>behaviour</w:t>
+      </w:r>
+      <w:proofErr w:type="spellEnd"/>
+      <w:r>
+        <w:t xml:space="preserve"> directly into Incident because the status representation can change independently of the incident itself.</w:t>
       </w:r>
     </w:p>
     <w:p>
@@ -881,7 +1342,47 @@
         <w:t xml:space="preserve">Participants: </w:t>
       </w:r>
       <w:r>
-        <w:t>Subject – Incident; Observer – IncidentObserver; Concrete Observers – SecurityTeam, MedicalTeam, FacilitiesStaff, AccessControlUnit.</w:t>
+        <w:t xml:space="preserve">Subject – Incident; Observer – </w:t>
+      </w:r>
+      <w:proofErr w:type="spellStart"/>
+      <w:r>
+        <w:t>IncidentObserver</w:t>
+      </w:r>
+      <w:proofErr w:type="spellEnd"/>
+      <w:r>
+        <w:t xml:space="preserve">; Concrete Observers – </w:t>
+      </w:r>
+      <w:proofErr w:type="spellStart"/>
+      <w:r>
+        <w:t>SecurityTeam</w:t>
+      </w:r>
+      <w:proofErr w:type="spellEnd"/>
+      <w:r>
+        <w:t xml:space="preserve">, </w:t>
+      </w:r>
+      <w:proofErr w:type="spellStart"/>
+      <w:r>
+        <w:t>MedicalTeam</w:t>
+      </w:r>
+      <w:proofErr w:type="spellEnd"/>
+      <w:r>
+        <w:t xml:space="preserve">, </w:t>
+      </w:r>
+      <w:proofErr w:type="spellStart"/>
+      <w:r>
+        <w:t>FacilitiesStaff</w:t>
+      </w:r>
+      <w:proofErr w:type="spellEnd"/>
+      <w:r>
+        <w:t xml:space="preserve">, </w:t>
+      </w:r>
+      <w:proofErr w:type="spellStart"/>
+      <w:r>
+        <w:t>AccessControlUnit</w:t>
+      </w:r>
+      <w:proofErr w:type="spellEnd"/>
+      <w:r>
+        <w:t>.</w:t>
       </w:r>
     </w:p>
     <w:p>
@@ -892,7 +1393,15 @@
         <w:t xml:space="preserve">Why Observer? </w:t>
       </w:r>
       <w:r>
-        <w:t>It avoids hard-coding each response component into Incident. New observers can be added without changing the core incident class.</w:t>
+        <w:t xml:space="preserve">It avoids </w:t>
+      </w:r>
+      <w:proofErr w:type="gramStart"/>
+      <w:r>
+        <w:t>hard-coding</w:t>
+      </w:r>
+      <w:proofErr w:type="gramEnd"/>
+      <w:r>
+        <w:t xml:space="preserve"> each response component into Incident. New observers can be added without changing the core incident class.</w:t>
       </w:r>
     </w:p>
     <w:p>
@@ -924,7 +1433,15 @@
         <w:pStyle w:val="ListBullet"/>
       </w:pPr>
       <w:r>
-        <w:t>Incident owns its current IncidentState, since it creates, replaces and deletes the state.</w:t>
+        <w:t xml:space="preserve">Incident owns its current </w:t>
+      </w:r>
+      <w:proofErr w:type="spellStart"/>
+      <w:r>
+        <w:t>IncidentState</w:t>
+      </w:r>
+      <w:proofErr w:type="spellEnd"/>
+      <w:r>
+        <w:t>, since it creates, replaces and deletes the state.</w:t>
       </w:r>
     </w:p>
     <w:p>
@@ -975,17 +1492,29 @@
     <w:p>
       <w:r>
         <w:lastRenderedPageBreak/>
-        <w:t>The six patterns therefore form one integrated CampusGuard design rather than six unrelated pattern demonstrations.</w:t>
+        <w:t xml:space="preserve">The six patterns therefore form one integrated </w:t>
+      </w:r>
+      <w:proofErr w:type="spellStart"/>
+      <w:r>
+        <w:t>CampusGuard</w:t>
+      </w:r>
+      <w:proofErr w:type="spellEnd"/>
+      <w:r>
+        <w:t xml:space="preserve"> design rather than six unrelated pattern demonstrations.</w:t>
       </w:r>
     </w:p>
     <w:p/>
     <w:p/>
     <w:p>
+      <w:pPr>
+        <w:pStyle w:val="Heading1"/>
+      </w:pPr>
       <w:r>
         <w:rPr>
           <w:noProof/>
           <w:lang w:val="en-ZA"/>
         </w:rPr>
+        <w:lastRenderedPageBreak/>
         <w:drawing>
           <wp:inline distT="0" distB="0" distL="0" distR="0" wp14:anchorId="0C1936C2" wp14:editId="3E566839">
             <wp:extent cx="5799455" cy="3192780"/>
@@ -1017,6 +1546,552 @@
                     <a:xfrm>
                       <a:off x="0" y="0"/>
                       <a:ext cx="5806361" cy="3196582"/>
+                    </a:xfrm>
+                    <a:prstGeom prst="rect">
+                      <a:avLst/>
+                    </a:prstGeom>
+                  </pic:spPr>
+                </pic:pic>
+              </a:graphicData>
+            </a:graphic>
+          </wp:inline>
+        </w:drawing>
+      </w:r>
+    </w:p>
+    <w:p>
+      <w:pPr>
+        <w:pStyle w:val="Heading1"/>
+      </w:pPr>
+    </w:p>
+    <w:p>
+      <w:pPr>
+        <w:pStyle w:val="Heading1"/>
+      </w:pPr>
+      <w:r>
+        <w:rPr>
+          <w:lang w:val="en-GB"/>
+        </w:rPr>
+        <w:drawing>
+          <wp:inline distT="0" distB="0" distL="0" distR="0" wp14:anchorId="63AF9EC2" wp14:editId="3B7FE8E0">
+            <wp:extent cx="6309360" cy="3800475"/>
+            <wp:effectExtent l="0" t="0" r="0" b="9525"/>
+            <wp:docPr id="697080804" name="Picture 2"/>
+            <wp:cNvGraphicFramePr>
+              <a:graphicFrameLocks xmlns:a="http://schemas.openxmlformats.org/drawingml/2006/main" noChangeAspect="1"/>
+            </wp:cNvGraphicFramePr>
+            <a:graphic xmlns:a="http://schemas.openxmlformats.org/drawingml/2006/main">
+              <a:graphicData uri="http://schemas.openxmlformats.org/drawingml/2006/picture">
+                <pic:pic xmlns:pic="http://schemas.openxmlformats.org/drawingml/2006/picture">
+                  <pic:nvPicPr>
+                    <pic:cNvPr id="0" name="Picture 6"/>
+                    <pic:cNvPicPr>
+                      <a:picLocks noChangeAspect="1" noChangeArrowheads="1"/>
+                    </pic:cNvPicPr>
+                  </pic:nvPicPr>
+                  <pic:blipFill>
+                    <a:blip r:embed="rId7">
+                      <a:extLst>
+                        <a:ext uri="{28A0092B-C50C-407E-A947-70E740481C1C}">
+                          <a14:useLocalDpi xmlns:a14="http://schemas.microsoft.com/office/drawing/2010/main" val="0"/>
+                        </a:ext>
+                      </a:extLst>
+                    </a:blip>
+                    <a:srcRect/>
+                    <a:stretch>
+                      <a:fillRect/>
+                    </a:stretch>
+                  </pic:blipFill>
+                  <pic:spPr bwMode="auto">
+                    <a:xfrm>
+                      <a:off x="0" y="0"/>
+                      <a:ext cx="6309360" cy="3800475"/>
+                    </a:xfrm>
+                    <a:prstGeom prst="rect">
+                      <a:avLst/>
+                    </a:prstGeom>
+                    <a:noFill/>
+                    <a:ln>
+                      <a:noFill/>
+                    </a:ln>
+                  </pic:spPr>
+                </pic:pic>
+              </a:graphicData>
+            </a:graphic>
+          </wp:inline>
+        </w:drawing>
+      </w:r>
+    </w:p>
+    <w:p>
+      <w:pPr>
+        <w:pStyle w:val="Heading1"/>
+      </w:pPr>
+      <w:r>
+        <w:lastRenderedPageBreak/>
+        <w:drawing>
+          <wp:inline distT="0" distB="0" distL="0" distR="0" wp14:anchorId="48670844" wp14:editId="52652681">
+            <wp:extent cx="6309360" cy="2599690"/>
+            <wp:effectExtent l="0" t="0" r="0" b="0"/>
+            <wp:docPr id="863221333" name="Picture 1"/>
+            <wp:cNvGraphicFramePr>
+              <a:graphicFrameLocks xmlns:a="http://schemas.openxmlformats.org/drawingml/2006/main" noChangeAspect="1"/>
+            </wp:cNvGraphicFramePr>
+            <a:graphic xmlns:a="http://schemas.openxmlformats.org/drawingml/2006/main">
+              <a:graphicData uri="http://schemas.openxmlformats.org/drawingml/2006/picture">
+                <pic:pic xmlns:pic="http://schemas.openxmlformats.org/drawingml/2006/picture">
+                  <pic:nvPicPr>
+                    <pic:cNvPr id="863221333" name=""/>
+                    <pic:cNvPicPr/>
+                  </pic:nvPicPr>
+                  <pic:blipFill>
+                    <a:blip r:embed="rId8"/>
+                    <a:stretch>
+                      <a:fillRect/>
+                    </a:stretch>
+                  </pic:blipFill>
+                  <pic:spPr>
+                    <a:xfrm>
+                      <a:off x="0" y="0"/>
+                      <a:ext cx="6309360" cy="2599690"/>
+                    </a:xfrm>
+                    <a:prstGeom prst="rect">
+                      <a:avLst/>
+                    </a:prstGeom>
+                  </pic:spPr>
+                </pic:pic>
+              </a:graphicData>
+            </a:graphic>
+          </wp:inline>
+        </w:drawing>
+      </w:r>
+      <w:r>
+        <w:br/>
+      </w:r>
+      <w:r>
+        <w:br/>
+      </w:r>
+      <w:r>
+        <w:br/>
+      </w:r>
+      <w:r>
+        <w:t>11. GDB and Valgrind investigation</w:t>
+      </w:r>
+      <w:r>
+        <w:br/>
+      </w:r>
+    </w:p>
+    <w:p>
+      <w:r>
+        <w:t>## GDB</w:t>
+      </w:r>
+    </w:p>
+    <w:p/>
+    <w:p>
+      <w:r>
+        <w:t xml:space="preserve">We found a bug: if an </w:t>
+      </w:r>
+      <w:proofErr w:type="spellStart"/>
+      <w:r>
+        <w:t>IncidentResponseReceiver</w:t>
+      </w:r>
+      <w:proofErr w:type="spellEnd"/>
+      <w:r>
+        <w:t xml:space="preserve"> ever gets built with a null Incident pointer, the program crashes the first time a command reaches it.</w:t>
+      </w:r>
+    </w:p>
+    <w:p/>
+    <w:p>
+      <w:r>
+        <w:t xml:space="preserve">We reproduced it by adding this to </w:t>
+      </w:r>
+      <w:proofErr w:type="gramStart"/>
+      <w:r>
+        <w:t>main(</w:t>
+      </w:r>
+      <w:proofErr w:type="gramEnd"/>
+      <w:r>
+        <w:t>) for testing:</w:t>
+      </w:r>
+    </w:p>
+    <w:p/>
+    <w:p>
+      <w:proofErr w:type="spellStart"/>
+      <w:r>
+        <w:t>IncidentResponseReceiver</w:t>
+      </w:r>
+      <w:proofErr w:type="spellEnd"/>
+      <w:r>
+        <w:t xml:space="preserve">* </w:t>
+      </w:r>
+      <w:proofErr w:type="spellStart"/>
+      <w:r>
+        <w:t>badReceiver</w:t>
+      </w:r>
+      <w:proofErr w:type="spellEnd"/>
+      <w:r>
+        <w:t xml:space="preserve"> = new </w:t>
+      </w:r>
+      <w:proofErr w:type="spellStart"/>
+      <w:proofErr w:type="gramStart"/>
+      <w:r>
+        <w:t>IncidentResponseReceiver</w:t>
+      </w:r>
+      <w:proofErr w:type="spellEnd"/>
+      <w:r>
+        <w:t>(</w:t>
+      </w:r>
+      <w:proofErr w:type="gramEnd"/>
+      <w:r>
+        <w:t>&amp;mediator, 0);</w:t>
+      </w:r>
+    </w:p>
+    <w:p>
+      <w:proofErr w:type="spellStart"/>
+      <w:r>
+        <w:t>badReceiver</w:t>
+      </w:r>
+      <w:proofErr w:type="spellEnd"/>
+      <w:r>
+        <w:t>-&gt;dispatch("Nowhere");</w:t>
+      </w:r>
+    </w:p>
+    <w:p/>
+    <w:p>
+      <w:r>
+        <w:t xml:space="preserve">Running under </w:t>
+      </w:r>
+      <w:proofErr w:type="spellStart"/>
+      <w:r>
+        <w:t>gdb</w:t>
+      </w:r>
+      <w:proofErr w:type="spellEnd"/>
+      <w:r>
+        <w:t>:</w:t>
+      </w:r>
+    </w:p>
+    <w:p/>
+    <w:p>
+      <w:r>
+        <w:t>Program received signal SIGSEGV, Segmentation fault.</w:t>
+      </w:r>
+    </w:p>
+    <w:p>
+      <w:r>
+        <w:t xml:space="preserve">0x... in </w:t>
+      </w:r>
+      <w:proofErr w:type="gramStart"/>
+      <w:r>
+        <w:t>Incident::</w:t>
+      </w:r>
+      <w:proofErr w:type="spellStart"/>
+      <w:proofErr w:type="gramEnd"/>
+      <w:r>
+        <w:t>setStatus</w:t>
+      </w:r>
+      <w:proofErr w:type="spellEnd"/>
+      <w:r>
+        <w:t xml:space="preserve"> (this=0x0, ...) at Incident.cpp:39</w:t>
+      </w:r>
+    </w:p>
+    <w:p>
+      <w:r>
+        <w:t>39          delete state;</w:t>
+      </w:r>
+    </w:p>
+    <w:p>
+      <w:r>
+        <w:t>(</w:t>
+      </w:r>
+      <w:proofErr w:type="spellStart"/>
+      <w:r>
+        <w:t>gdb</w:t>
+      </w:r>
+      <w:proofErr w:type="spellEnd"/>
+      <w:r>
+        <w:t xml:space="preserve">) </w:t>
+      </w:r>
+      <w:proofErr w:type="spellStart"/>
+      <w:r>
+        <w:t>bt</w:t>
+      </w:r>
+      <w:proofErr w:type="spellEnd"/>
+    </w:p>
+    <w:p>
+      <w:r>
+        <w:t>#</w:t>
+      </w:r>
+      <w:proofErr w:type="gramStart"/>
+      <w:r>
+        <w:t>0  Incident::</w:t>
+      </w:r>
+      <w:proofErr w:type="spellStart"/>
+      <w:proofErr w:type="gramEnd"/>
+      <w:r>
+        <w:t>setStatus</w:t>
+      </w:r>
+      <w:proofErr w:type="spellEnd"/>
+      <w:r>
+        <w:t xml:space="preserve"> (this=0x0, ...) at Incident.cpp:39</w:t>
+      </w:r>
+    </w:p>
+    <w:p>
+      <w:r>
+        <w:t>#</w:t>
+      </w:r>
+      <w:proofErr w:type="gramStart"/>
+      <w:r>
+        <w:t xml:space="preserve">1  </w:t>
+      </w:r>
+      <w:proofErr w:type="spellStart"/>
+      <w:r>
+        <w:t>IncidentResponseReceiver</w:t>
+      </w:r>
+      <w:proofErr w:type="spellEnd"/>
+      <w:r>
+        <w:t>::</w:t>
+      </w:r>
+      <w:proofErr w:type="gramEnd"/>
+      <w:r>
+        <w:t>dispatch (...) at IncidentResponseReceiver.cpp:18</w:t>
+      </w:r>
+    </w:p>
+    <w:p>
+      <w:r>
+        <w:t>#</w:t>
+      </w:r>
+      <w:proofErr w:type="gramStart"/>
+      <w:r>
+        <w:t>2  main</w:t>
+      </w:r>
+      <w:proofErr w:type="gramEnd"/>
+      <w:r>
+        <w:t xml:space="preserve"> () at main.cpp:130</w:t>
+      </w:r>
+    </w:p>
+    <w:p/>
+    <w:p>
+      <w:r>
+        <w:t xml:space="preserve">this=0x0 told us the Incident pointer was null. </w:t>
+      </w:r>
+      <w:proofErr w:type="gramStart"/>
+      <w:r>
+        <w:t>dispatch(</w:t>
+      </w:r>
+      <w:proofErr w:type="gramEnd"/>
+      <w:r>
+        <w:t>) was calling incident-&gt;</w:t>
+      </w:r>
+      <w:proofErr w:type="spellStart"/>
+      <w:proofErr w:type="gramStart"/>
+      <w:r>
+        <w:t>setStatus</w:t>
+      </w:r>
+      <w:proofErr w:type="spellEnd"/>
+      <w:r>
+        <w:t>(</w:t>
+      </w:r>
+      <w:proofErr w:type="gramEnd"/>
+      <w:r>
+        <w:t xml:space="preserve">) without checking if incident </w:t>
+      </w:r>
+      <w:proofErr w:type="gramStart"/>
+      <w:r>
+        <w:t>actually exists</w:t>
+      </w:r>
+      <w:proofErr w:type="gramEnd"/>
+      <w:r>
+        <w:t>.</w:t>
+      </w:r>
+    </w:p>
+    <w:p>
+      <w:r>
+        <w:lastRenderedPageBreak/>
+        <w:t xml:space="preserve">Fix: never construct an </w:t>
+      </w:r>
+      <w:proofErr w:type="spellStart"/>
+      <w:r>
+        <w:t>IncidentResponseReceiver</w:t>
+      </w:r>
+      <w:proofErr w:type="spellEnd"/>
+      <w:r>
+        <w:t xml:space="preserve"> before its Incident object exists. That's how main.cpp does it now. We deleted the test lines </w:t>
+      </w:r>
+      <w:proofErr w:type="gramStart"/>
+      <w:r>
+        <w:t>afterwards,</w:t>
+      </w:r>
+      <w:proofErr w:type="gramEnd"/>
+      <w:r>
+        <w:t xml:space="preserve"> they're not part of the real program.</w:t>
+      </w:r>
+    </w:p>
+    <w:p/>
+    <w:p>
+      <w:r>
+        <w:t>## Valgrind</w:t>
+      </w:r>
+    </w:p>
+    <w:p>
+      <w:proofErr w:type="spellStart"/>
+      <w:r>
+        <w:t>valgrind</w:t>
+      </w:r>
+      <w:proofErr w:type="spellEnd"/>
+      <w:r>
+        <w:t xml:space="preserve"> --leak-check=full --show-leak-kinds=all --track-origins=</w:t>
+      </w:r>
+      <w:proofErr w:type="gramStart"/>
+      <w:r>
+        <w:t>yes .</w:t>
+      </w:r>
+      <w:proofErr w:type="gramEnd"/>
+      <w:r>
+        <w:t>/</w:t>
+      </w:r>
+      <w:proofErr w:type="spellStart"/>
+      <w:r>
+        <w:t>CampusGuard</w:t>
+      </w:r>
+      <w:proofErr w:type="spellEnd"/>
+    </w:p>
+    <w:p>
+      <w:r>
+        <w:t>==923== HEAP SUMMARY:</w:t>
+      </w:r>
+    </w:p>
+    <w:p>
+      <w:r>
+        <w:t>==923==     in use at exit: 0 bytes in 0 blocks</w:t>
+      </w:r>
+    </w:p>
+    <w:p>
+      <w:r>
+        <w:t xml:space="preserve">==923==   total heap usage: 51 </w:t>
+      </w:r>
+      <w:proofErr w:type="spellStart"/>
+      <w:r>
+        <w:t>allocs</w:t>
+      </w:r>
+      <w:proofErr w:type="spellEnd"/>
+      <w:r>
+        <w:t>, 51 frees, 79,523 bytes allocated</w:t>
+      </w:r>
+    </w:p>
+    <w:p>
+      <w:r>
+        <w:t>==923==</w:t>
+      </w:r>
+    </w:p>
+    <w:p>
+      <w:r>
+        <w:t>==923== All heap blocks were freed -- no leaks are possible</w:t>
+      </w:r>
+    </w:p>
+    <w:p>
+      <w:r>
+        <w:t>==923== ERROR SUMMARY: 0 errors from 0 contexts (suppressed: 0 from 0)</w:t>
+      </w:r>
+    </w:p>
+    <w:p/>
+    <w:p>
+      <w:r>
+        <w:t xml:space="preserve">No leaks, no errors. Makes sense: </w:t>
+      </w:r>
+      <w:proofErr w:type="spellStart"/>
+      <w:r>
+        <w:t>CommandInvoker</w:t>
+      </w:r>
+      <w:proofErr w:type="spellEnd"/>
+      <w:r>
+        <w:t xml:space="preserve"> deletes the old Command whenever a new one is set, Incident deletes its old </w:t>
+      </w:r>
+      <w:proofErr w:type="spellStart"/>
+      <w:r>
+        <w:t>IncidentState</w:t>
+      </w:r>
+      <w:proofErr w:type="spellEnd"/>
+      <w:r>
+        <w:t xml:space="preserve"> whenever it changes, and every base class with virtual functions has a virtual destructor.</w:t>
+      </w:r>
+    </w:p>
+    <w:p/>
+    <w:p>
+      <w:pPr>
+        <w:rPr>
+          <w:lang w:val="en-GB"/>
+        </w:rPr>
+      </w:pPr>
+    </w:p>
+    <w:p>
+      <w:r>
+        <w:rPr>
+          <w:noProof/>
+        </w:rPr>
+        <w:lastRenderedPageBreak/>
+        <w:drawing>
+          <wp:inline distT="0" distB="0" distL="0" distR="0" wp14:anchorId="23984315" wp14:editId="4A555365">
+            <wp:extent cx="6309360" cy="5274310"/>
+            <wp:effectExtent l="0" t="0" r="0" b="2540"/>
+            <wp:docPr id="1309392060" name="Picture 3"/>
+            <wp:cNvGraphicFramePr>
+              <a:graphicFrameLocks xmlns:a="http://schemas.openxmlformats.org/drawingml/2006/main" noChangeAspect="1"/>
+            </wp:cNvGraphicFramePr>
+            <a:graphic xmlns:a="http://schemas.openxmlformats.org/drawingml/2006/main">
+              <a:graphicData uri="http://schemas.openxmlformats.org/drawingml/2006/picture">
+                <pic:pic xmlns:pic="http://schemas.openxmlformats.org/drawingml/2006/picture">
+                  <pic:nvPicPr>
+                    <pic:cNvPr id="1309392060" name="Picture 1309392060"/>
+                    <pic:cNvPicPr/>
+                  </pic:nvPicPr>
+                  <pic:blipFill>
+                    <a:blip r:embed="rId9"/>
+                    <a:stretch>
+                      <a:fillRect/>
+                    </a:stretch>
+                  </pic:blipFill>
+                  <pic:spPr>
+                    <a:xfrm>
+                      <a:off x="0" y="0"/>
+                      <a:ext cx="6309360" cy="5274310"/>
+                    </a:xfrm>
+                    <a:prstGeom prst="rect">
+                      <a:avLst/>
+                    </a:prstGeom>
+                  </pic:spPr>
+                </pic:pic>
+              </a:graphicData>
+            </a:graphic>
+          </wp:inline>
+        </w:drawing>
+      </w:r>
+      <w:r>
+        <w:rPr>
+          <w:noProof/>
+        </w:rPr>
+        <w:drawing>
+          <wp:inline distT="0" distB="0" distL="0" distR="0" wp14:anchorId="5AC8A9BD" wp14:editId="66DE88B6">
+            <wp:extent cx="6309360" cy="2396490"/>
+            <wp:effectExtent l="0" t="0" r="0" b="3810"/>
+            <wp:docPr id="38589164" name="Picture 4"/>
+            <wp:cNvGraphicFramePr>
+              <a:graphicFrameLocks xmlns:a="http://schemas.openxmlformats.org/drawingml/2006/main" noChangeAspect="1"/>
+            </wp:cNvGraphicFramePr>
+            <a:graphic xmlns:a="http://schemas.openxmlformats.org/drawingml/2006/main">
+              <a:graphicData uri="http://schemas.openxmlformats.org/drawingml/2006/picture">
+                <pic:pic xmlns:pic="http://schemas.openxmlformats.org/drawingml/2006/picture">
+                  <pic:nvPicPr>
+                    <pic:cNvPr id="38589164" name="Picture 38589164"/>
+                    <pic:cNvPicPr/>
+                  </pic:nvPicPr>
+                  <pic:blipFill>
+                    <a:blip r:embed="rId10"/>
+                    <a:stretch>
+                      <a:fillRect/>
+                    </a:stretch>
+                  </pic:blipFill>
+                  <pic:spPr>
+                    <a:xfrm>
+                      <a:off x="0" y="0"/>
+                      <a:ext cx="6309360" cy="2396490"/>
                     </a:xfrm>
                     <a:prstGeom prst="rect">
                       <a:avLst/>
@@ -1852,7 +2927,6 @@
   <w:style w:type="character" w:default="1" w:styleId="DefaultParagraphFont">
     <w:name w:val="Default Paragraph Font"/>
     <w:uiPriority w:val="1"/>
-    <w:semiHidden/>
     <w:unhideWhenUsed/>
   </w:style>
   <w:style w:type="table" w:default="1" w:styleId="TableNormal">

</xml_diff>